<commit_message>
the final right translated doc
</commit_message>
<xml_diff>
--- a/translated_xml.docx
+++ b/translated_xml.docx
@@ -4,7 +4,7 @@
   <w:body>
     <w:p>
       <w:pPr>
-        <w:jc w:val="left"/>
+        <w:jc w:val="center"/>
       </w:pPr>
       <w:r>
         <w:rPr>
@@ -16,7 +16,7 @@
     </w:p>
     <w:p>
       <w:pPr>
-        <w:jc w:val="left"/>
+        <w:jc w:val="center"/>
       </w:pPr>
       <w:r>
         <w:rPr/>
@@ -48,7 +48,6 @@
     <w:p>
       <w:pPr>
         <w:pStyle w:val="Heading1"/>
-        <w:jc w:val="left"/>
       </w:pPr>
       <w:r>
         <w:rPr/>
@@ -56,18 +55,14 @@
       </w:r>
     </w:p>
     <w:p>
-      <w:pPr>
-        <w:jc w:val="left"/>
-      </w:pPr>
+      <w:pPr/>
       <w:r>
         <w:rPr/>
         <w:t>This paragraph contains standard Arabic text with some key terms such as patient, diagnosis, and follow-up plan. The goal is to test the translation at the paragraph level, rather than at the level of each small formatting element.</w:t>
       </w:r>
     </w:p>
     <w:p>
-      <w:pPr>
-        <w:jc w:val="left"/>
-      </w:pPr>
+      <w:pPr/>
       <w:r>
         <w:rPr>
           <w:b w:val="0"/>
@@ -108,7 +103,6 @@
     <w:p>
       <w:pPr>
         <w:pStyle w:val="ListBullet"/>
-        <w:jc w:val="left"/>
       </w:pPr>
       <w:r>
         <w:rPr/>
@@ -118,7 +112,6 @@
     <w:p>
       <w:pPr>
         <w:pStyle w:val="ListBullet"/>
-        <w:jc w:val="left"/>
       </w:pPr>
       <w:r>
         <w:rPr/>
@@ -128,7 +121,6 @@
     <w:p>
       <w:pPr>
         <w:pStyle w:val="ListBullet"/>
-        <w:jc w:val="left"/>
       </w:pPr>
       <w:r>
         <w:rPr/>
@@ -138,7 +130,6 @@
     <w:p>
       <w:pPr>
         <w:pStyle w:val="Heading2"/>
-        <w:jc w:val="left"/>
       </w:pPr>
       <w:r>
         <w:rPr/>
@@ -148,7 +139,6 @@
     <w:p>
       <w:pPr>
         <w:pStyle w:val="ListNumber"/>
-        <w:jc w:val="left"/>
       </w:pPr>
       <w:r>
         <w:rPr/>
@@ -158,7 +148,6 @@
     <w:p>
       <w:pPr>
         <w:pStyle w:val="ListNumber"/>
-        <w:jc w:val="left"/>
       </w:pPr>
       <w:r>
         <w:rPr/>
@@ -168,7 +157,6 @@
     <w:p>
       <w:pPr>
         <w:pStyle w:val="ListNumber"/>
-        <w:jc w:val="left"/>
       </w:pPr>
       <w:r>
         <w:rPr/>
@@ -178,7 +166,6 @@
     <w:p>
       <w:pPr>
         <w:pStyle w:val="Heading1"/>
-        <w:jc w:val="left"/>
       </w:pPr>
       <w:r>
         <w:rPr/>
@@ -205,9 +192,7 @@
             <w:vAlign w:val="center"/>
           </w:tcPr>
           <w:p>
-            <w:pPr>
-              <w:jc w:val="left"/>
-            </w:pPr>
+            <w:pPr/>
             <w:r>
               <w:rPr/>
             </w:r>
@@ -226,9 +211,7 @@
             <w:vAlign w:val="center"/>
           </w:tcPr>
           <w:p>
-            <w:pPr>
-              <w:jc w:val="left"/>
-            </w:pPr>
+            <w:pPr/>
             <w:r>
               <w:rPr/>
             </w:r>
@@ -247,9 +230,7 @@
             <w:vAlign w:val="center"/>
           </w:tcPr>
           <w:p>
-            <w:pPr>
-              <w:jc w:val="left"/>
-            </w:pPr>
+            <w:pPr/>
             <w:r>
               <w:rPr/>
             </w:r>
@@ -268,9 +249,7 @@
             <w:vAlign w:val="center"/>
           </w:tcPr>
           <w:p>
-            <w:pPr>
-              <w:jc w:val="left"/>
-            </w:pPr>
+            <w:pPr/>
             <w:r>
               <w:rPr/>
             </w:r>
@@ -308,9 +287,7 @@
             <w:tcW w:type="dxa" w:w="2160"/>
           </w:tcPr>
           <w:p>
-            <w:pPr>
-              <w:jc w:val="left"/>
-            </w:pPr>
+            <w:pPr/>
             <w:r>
               <w:rPr/>
             </w:r>
@@ -328,9 +305,7 @@
             <w:tcW w:type="dxa" w:w="2160"/>
           </w:tcPr>
           <w:p>
-            <w:pPr>
-              <w:jc w:val="left"/>
-            </w:pPr>
+            <w:pPr/>
             <w:r>
               <w:rPr/>
             </w:r>
@@ -348,9 +323,7 @@
             <w:tcW w:type="dxa" w:w="2160"/>
           </w:tcPr>
           <w:p>
-            <w:pPr>
-              <w:jc w:val="left"/>
-            </w:pPr>
+            <w:pPr/>
             <w:r>
               <w:rPr/>
             </w:r>
@@ -388,9 +361,7 @@
             <w:tcW w:type="dxa" w:w="2160"/>
           </w:tcPr>
           <w:p>
-            <w:pPr>
-              <w:jc w:val="left"/>
-            </w:pPr>
+            <w:pPr/>
             <w:r>
               <w:rPr/>
             </w:r>
@@ -408,9 +379,7 @@
             <w:tcW w:type="dxa" w:w="2160"/>
           </w:tcPr>
           <w:p>
-            <w:pPr>
-              <w:jc w:val="left"/>
-            </w:pPr>
+            <w:pPr/>
             <w:r>
               <w:rPr/>
             </w:r>
@@ -428,9 +397,7 @@
             <w:tcW w:type="dxa" w:w="2160"/>
           </w:tcPr>
           <w:p>
-            <w:pPr>
-              <w:jc w:val="left"/>
-            </w:pPr>
+            <w:pPr/>
             <w:r>
               <w:rPr/>
             </w:r>
@@ -468,9 +435,7 @@
             <w:tcW w:type="dxa" w:w="2160"/>
           </w:tcPr>
           <w:p>
-            <w:pPr>
-              <w:jc w:val="left"/>
-            </w:pPr>
+            <w:pPr/>
             <w:r>
               <w:rPr/>
             </w:r>
@@ -488,9 +453,7 @@
             <w:tcW w:type="dxa" w:w="2160"/>
           </w:tcPr>
           <w:p>
-            <w:pPr>
-              <w:jc w:val="left"/>
-            </w:pPr>
+            <w:pPr/>
             <w:r>
               <w:rPr/>
             </w:r>
@@ -508,9 +471,7 @@
             <w:tcW w:type="dxa" w:w="2160"/>
           </w:tcPr>
           <w:p>
-            <w:pPr>
-              <w:jc w:val="left"/>
-            </w:pPr>
+            <w:pPr/>
             <w:r>
               <w:rPr/>
             </w:r>
@@ -531,9 +492,7 @@
             <w:gridSpan w:val="4"/>
           </w:tcPr>
           <w:p>
-            <w:pPr>
-              <w:jc w:val="left"/>
-            </w:pPr>
+            <w:pPr/>
             <w:r>
               <w:rPr/>
             </w:r>
@@ -552,7 +511,6 @@
     <w:p>
       <w:pPr>
         <w:pStyle w:val="Heading2"/>
-        <w:jc w:val="left"/>
       </w:pPr>
       <w:r>
         <w:rPr/>
@@ -577,9 +535,7 @@
             <w:tcW w:type="dxa" w:w="2880"/>
           </w:tcPr>
           <w:p>
-            <w:pPr>
-              <w:jc w:val="left"/>
-            </w:pPr>
+            <w:pPr/>
             <w:r>
               <w:rPr/>
             </w:r>
@@ -597,9 +553,7 @@
             <w:tcW w:type="dxa" w:w="2880"/>
           </w:tcPr>
           <w:p>
-            <w:pPr>
-              <w:jc w:val="left"/>
-            </w:pPr>
+            <w:pPr/>
             <w:r>
               <w:rPr/>
             </w:r>
@@ -617,9 +571,7 @@
             <w:tcW w:type="dxa" w:w="2880"/>
           </w:tcPr>
           <w:p>
-            <w:pPr>
-              <w:jc w:val="left"/>
-            </w:pPr>
+            <w:pPr/>
             <w:r>
               <w:rPr/>
             </w:r>
@@ -639,9 +591,7 @@
             <w:tcW w:type="dxa" w:w="2880"/>
           </w:tcPr>
           <w:p>
-            <w:pPr>
-              <w:jc w:val="left"/>
-            </w:pPr>
+            <w:pPr/>
             <w:r>
               <w:rPr/>
             </w:r>
@@ -677,9 +627,7 @@
             <w:tcW w:type="dxa" w:w="2880"/>
           </w:tcPr>
           <w:p>
-            <w:pPr>
-              <w:jc w:val="left"/>
-            </w:pPr>
+            <w:pPr/>
             <w:r>
               <w:rPr/>
             </w:r>
@@ -699,9 +647,7 @@
             <w:tcW w:type="dxa" w:w="2880"/>
           </w:tcPr>
           <w:p>
-            <w:pPr>
-              <w:jc w:val="left"/>
-            </w:pPr>
+            <w:pPr/>
             <w:r>
               <w:rPr/>
             </w:r>
@@ -737,9 +683,7 @@
             <w:tcW w:type="dxa" w:w="2880"/>
           </w:tcPr>
           <w:p>
-            <w:pPr>
-              <w:jc w:val="left"/>
-            </w:pPr>
+            <w:pPr/>
             <w:r>
               <w:rPr/>
             </w:r>
@@ -759,9 +703,7 @@
             <w:tcW w:type="dxa" w:w="2880"/>
           </w:tcPr>
           <w:p>
-            <w:pPr>
-              <w:jc w:val="left"/>
-            </w:pPr>
+            <w:pPr/>
             <w:r>
               <w:rPr/>
             </w:r>
@@ -797,9 +739,7 @@
             <w:tcW w:type="dxa" w:w="2880"/>
           </w:tcPr>
           <w:p>
-            <w:pPr>
-              <w:jc w:val="left"/>
-            </w:pPr>
+            <w:pPr/>
             <w:r>
               <w:rPr/>
             </w:r>
@@ -815,9 +755,7 @@
       </w:tr>
     </w:tbl>
     <w:p>
-      <w:pPr>
-        <w:jc w:val="left"/>
-      </w:pPr>
+      <w:pPr/>
       <w:r>
         <w:rPr>
           <w:b/>
@@ -838,7 +776,6 @@
     <w:p>
       <w:pPr>
         <w:pStyle w:val="Heading1"/>
-        <w:jc w:val="left"/>
       </w:pPr>
       <w:r>
         <w:rPr/>
@@ -846,9 +783,7 @@
       </w:r>
     </w:p>
     <w:p>
-      <w:pPr>
-        <w:jc w:val="left"/>
-      </w:pPr>
+      <w:pPr/>
       <w:r>
         <w:rPr/>
         <w:t>First line: This is an example of a paragraph containing more than one line within the same paragraph.</w:t>
@@ -865,9 +800,7 @@
       </w:r>
     </w:p>
     <w:p>
-      <w:pPr>
-        <w:jc w:val="left"/>
-      </w:pPr>
+      <w:pPr/>
       <w:r>
         <w:rPr>
           <w:b/>
@@ -906,7 +839,7 @@
   <w:p>
     <w:pPr>
       <w:pStyle w:val="Footer"/>
-      <w:jc w:val="left"/>
+      <w:jc w:val="center"/>
     </w:pPr>
     <w:r>
       <w:rPr/>
@@ -921,7 +854,7 @@
   <w:p>
     <w:pPr>
       <w:pStyle w:val="Header"/>
-      <w:jc w:val="left"/>
+      <w:jc w:val="center"/>
     </w:pPr>
     <w:r>
       <w:rPr>

</xml_diff>